<commit_message>
Mindset 01 audio scripts: fix typos in the _markers docx with timings kept (WoMan, Sol, whenthe, thingshave, asmall, 16", 1", NO, Ohi, them.., after-, skillful), add a missing marker in track 45; fix IP'll, Hithere, Greek E in Audio Scripts.docx; carry translations over to the corrected texts; translate the corrected 'Look at the map' paragraph
Co-Authored-By: Claude Opus 5.5 <noreply@anthropic.com>
Claude-Session: https://claude.ai/code/session_012pSExQcto6evNseoCu5P9v
</commit_message>
<xml_diff>
--- a/assets/data/Mindset 01/Mindset1- Audio Scripts.docx
+++ b/assets/data/Mindset 01/Mindset1- Audio Scripts.docx
@@ -4415,7 +4415,7 @@
                 <w:sz w:val="23"/>
                 <w:szCs w:val="23"/>
               </w:rPr>
-              <w:t xml:space="preserve"> It's got an 'e' at the end. C-L-A-R-K-Ε.</w:t>
+              <w:t xml:space="preserve"> It's got an 'e' at the end. C-L-A-R-K-E.</w:t>
             </w:r>
           </w:p>
           <w:p>
@@ -5726,7 +5726,7 @@
                 <w:sz w:val="23"/>
                 <w:szCs w:val="23"/>
               </w:rPr>
-              <w:t xml:space="preserve"> Actually, David - no need to pick me up. The traffic lights have just changed and I can see the bus coming now. I'd better go - IP'll see you at home in a few minutes.</w:t>
+              <w:t xml:space="preserve"> Actually, David - no need to pick me up. The traffic lights have just changed and I can see the bus coming now. I'd better go - I'll see you at home in a few minutes.</w:t>
             </w:r>
           </w:p>
         </w:tc>
@@ -5815,7 +5815,7 @@
                 <w:sz w:val="23"/>
                 <w:szCs w:val="23"/>
               </w:rPr>
-              <w:t xml:space="preserve"> Hithere, Alicia! How was your weekend? You were on a sailing course down at the harbour, weren't you?</w:t>
+              <w:t xml:space="preserve"> Hi there, Alicia! How was your weekend? You were on a sailing course down at the harbour, weren't you?</w:t>
             </w:r>
           </w:p>
           <w:p>

</xml_diff>